<commit_message>
Prepare for public release: LICENSE, README, CITATION.cff, PDF guides
Adds MIT license, a public-facing README, and CITATION.cff for the
planned open community release. Also includes the consolidated Streamlit dashboard, shared sat_search/sat_download/
sat_forecast/sat_orbit modules, per-step PDF guides embedded in the app,
localhost-based Earth Engine auth (no more manual OAuth code entry), and
notebook output from recent runs.
</commit_message>
<xml_diff>
--- a/manuscript/EOScout_manuscript.docx
+++ b/manuscript/EOScout_manuscript.docx
@@ -16,7 +16,24 @@
           <w:sz w:val="30"/>
           <w:szCs w:val="30"/>
         </w:rPr>
-        <w:t xml:space="preserve">EOScout: An Open Framework for Federated Multi-Mission Satellite Data Discovery, Provenance-Aware Retrieval, and Dual-Method Overpass Forecasting over User-Defined Areas of Interest</w:t>
+        <w:t xml:space="preserve">EOScout: a Python toolkit for multi-mission satellite data search and overpass forecasting</w:t>
+      </w:r>
+    </w:p>
+    <w:p>
+      <w:pPr>
+        <w:spacing w:after="200" w:line="240"/>
+        <w:jc w:val="center"/>
+      </w:pPr>
+      <w:r>
+        <w:rPr>
+          <w:rFonts w:ascii="Times New Roman" w:cs="Times New Roman" w:eastAsia="Times New Roman" w:hAnsi="Times New Roman"/>
+          <w:i/>
+          <w:iCs/>
+          <w:color w:val="444444"/>
+          <w:sz w:val="20"/>
+          <w:szCs w:val="20"/>
+        </w:rPr>
+        <w:t xml:space="preserve">Running title: EOScout — multi-mission satellite search and overpass forecasting</w:t>
       </w:r>
     </w:p>
     <w:p>

</xml_diff>